<commit_message>
Update BRD with functional requirements
</commit_message>
<xml_diff>
--- a/FrontierAdminControl-BRD.docx
+++ b/FrontierAdminControl-BRD.docx
@@ -95,6 +95,18 @@
         </w:numPr>
       </w:pPr>
       <w:r>
+        <w:t xml:space="preserve">Unify Frontier enrollment into a single control across all apps, platforms, and agents</w:t>
+      </w:r>
+    </w:p>
+    <w:p>
+      <w:pPr>
+        <w:pStyle w:val="ListParagraph"/>
+        <w:numPr>
+          <w:ilvl w:val="0"/>
+          <w:numId w:val="1"/>
+        </w:numPr>
+      </w:pPr>
+      <w:r>
         <w:t xml:space="preserve">Support three access tiers: no access, all users, and specific users/groups</w:t>
       </w:r>
     </w:p>
@@ -107,19 +119,7 @@
         </w:numPr>
       </w:pPr>
       <w:r>
-        <w:t xml:space="preserve">Enforce a configurable user limit (currently 3) when selecting specific users or groups</w:t>
-      </w:r>
-    </w:p>
-    <w:p>
-      <w:pPr>
-        <w:pStyle w:val="ListParagraph"/>
-        <w:numPr>
-          <w:ilvl w:val="0"/>
-          <w:numId w:val="1"/>
-        </w:numPr>
-      </w:pPr>
-      <w:r>
-        <w:t xml:space="preserve">Deliver multiple UX variants to evaluate the optimal user experience through A/B testing</w:t>
+        <w:t xml:space="preserve">Support assignment via individual users and Entra groups (max 10,000 total users)</w:t>
       </w:r>
     </w:p>
     <w:p>
@@ -235,67 +235,175 @@
         <w:spacing w:before="300"/>
       </w:pPr>
       <w:r>
-        <w:t xml:space="preserve">User Stories</w:t>
-      </w:r>
-    </w:p>
-    <w:p>
-      <w:pPr>
-        <w:pStyle w:val="ListParagraph"/>
-        <w:numPr>
-          <w:ilvl w:val="0"/>
-          <w:numId w:val="1"/>
-        </w:numPr>
-      </w:pPr>
-      <w:r>
-        <w:t xml:space="preserve">As an M365 administrator, I want to disable Frontier features for all users so that my organization does not receive experimental features.</w:t>
-      </w:r>
-    </w:p>
-    <w:p>
-      <w:pPr>
-        <w:pStyle w:val="ListParagraph"/>
-        <w:numPr>
-          <w:ilvl w:val="0"/>
-          <w:numId w:val="1"/>
-        </w:numPr>
-      </w:pPr>
-      <w:r>
-        <w:t xml:space="preserve">As an M365 administrator, I want to enable Frontier features for all users so that everyone in my organization can access experimental features and agents.</w:t>
-      </w:r>
-    </w:p>
-    <w:p>
-      <w:pPr>
-        <w:pStyle w:val="ListParagraph"/>
-        <w:numPr>
-          <w:ilvl w:val="0"/>
-          <w:numId w:val="1"/>
-        </w:numPr>
-      </w:pPr>
-      <w:r>
-        <w:t xml:space="preserve">As an M365 administrator, I want to select specific users or groups to receive Frontier features so that I can pilot experimental features with a controlled set of users.</w:t>
-      </w:r>
-    </w:p>
-    <w:p>
-      <w:pPr>
-        <w:pStyle w:val="ListParagraph"/>
-        <w:numPr>
-          <w:ilvl w:val="0"/>
-          <w:numId w:val="1"/>
-        </w:numPr>
-      </w:pPr>
-      <w:r>
-        <w:t xml:space="preserve">As an M365 administrator, I want to see a warning when I exceed the allowed user limit so that I understand my configuration cannot be saved until corrected.</w:t>
-      </w:r>
-    </w:p>
-    <w:p>
-      <w:pPr>
-        <w:pStyle w:val="ListParagraph"/>
-        <w:numPr>
-          <w:ilvl w:val="0"/>
-          <w:numId w:val="1"/>
-        </w:numPr>
-      </w:pPr>
-      <w:r>
-        <w:t xml:space="preserve">As an M365 administrator, I want to cancel my unsaved changes so that I can revert to the last saved configuration without risk.</w:t>
+        <w:t xml:space="preserve">Functional Requirements</w:t>
+      </w:r>
+    </w:p>
+    <w:p>
+      <w:pPr>
+        <w:pStyle w:val="ListParagraph"/>
+        <w:numPr>
+          <w:ilvl w:val="0"/>
+          <w:numId w:val="1"/>
+        </w:numPr>
+      </w:pPr>
+      <w:r>
+        <w:t xml:space="preserve">The admin control provides three access tiers via radio buttons: No access, All users, and Specific groups or users.</w:t>
+      </w:r>
+    </w:p>
+    <w:p>
+      <w:pPr>
+        <w:pStyle w:val="ListParagraph"/>
+        <w:numPr>
+          <w:ilvl w:val="0"/>
+          <w:numId w:val="1"/>
+        </w:numPr>
+      </w:pPr>
+      <w:r>
+        <w:t xml:space="preserve">The default state for new tenants is No access.</w:t>
+      </w:r>
+    </w:p>
+    <w:p>
+      <w:pPr>
+        <w:pStyle w:val="ListParagraph"/>
+        <w:numPr>
+          <w:ilvl w:val="0"/>
+          <w:numId w:val="1"/>
+        </w:numPr>
+      </w:pPr>
+      <w:r>
+        <w:t xml:space="preserve">When "Specific groups or users" is selected, a combobox appears allowing the admin to search and select Entra users and groups.</w:t>
+      </w:r>
+    </w:p>
+    <w:p>
+      <w:pPr>
+        <w:pStyle w:val="ListParagraph"/>
+        <w:numPr>
+          <w:ilvl w:val="0"/>
+          <w:numId w:val="1"/>
+        </w:numPr>
+      </w:pPr>
+      <w:r>
+        <w:t xml:space="preserve">Total user assignment (via individual users and/or members within groups) may not exceed 10,000.</w:t>
+      </w:r>
+    </w:p>
+    <w:p>
+      <w:pPr>
+        <w:pStyle w:val="ListParagraph"/>
+        <w:numPr>
+          <w:ilvl w:val="0"/>
+          <w:numId w:val="1"/>
+        </w:numPr>
+      </w:pPr>
+      <w:r>
+        <w:t xml:space="preserve">Selected users and groups are displayed as dismissible tags; clicking the dismiss icon removes them.</w:t>
+      </w:r>
+    </w:p>
+    <w:p>
+      <w:pPr>
+        <w:pStyle w:val="ListParagraph"/>
+        <w:numPr>
+          <w:ilvl w:val="0"/>
+          <w:numId w:val="1"/>
+        </w:numPr>
+      </w:pPr>
+      <w:r>
+        <w:t xml:space="preserve">Validation is performed on save only, not in real-time. The admin may freely add users beyond the limit while editing.</w:t>
+      </w:r>
+    </w:p>
+    <w:p>
+      <w:pPr>
+        <w:pStyle w:val="ListParagraph"/>
+        <w:numPr>
+          <w:ilvl w:val="0"/>
+          <w:numId w:val="1"/>
+        </w:numPr>
+      </w:pPr>
+      <w:r>
+        <w:t xml:space="preserve">When save is attempted with an over-limit configuration, a warning banner appears and the save does not persist.</w:t>
+      </w:r>
+    </w:p>
+    <w:p>
+      <w:pPr>
+        <w:pStyle w:val="ListParagraph"/>
+        <w:numPr>
+          <w:ilvl w:val="0"/>
+          <w:numId w:val="1"/>
+        </w:numPr>
+      </w:pPr>
+      <w:r>
+        <w:t xml:space="preserve">Validation errors persist until the admin clicks Save (successfully) or Cancel. They do not auto-clear.</w:t>
+      </w:r>
+    </w:p>
+    <w:p>
+      <w:pPr>
+        <w:pStyle w:val="ListParagraph"/>
+        <w:numPr>
+          <w:ilvl w:val="0"/>
+          <w:numId w:val="1"/>
+        </w:numPr>
+      </w:pPr>
+      <w:r>
+        <w:t xml:space="preserve">When saved successfully, the baseline state is updated. If the access tier is No access or All users, any selected users/groups are discarded.</w:t>
+      </w:r>
+    </w:p>
+    <w:p>
+      <w:pPr>
+        <w:pStyle w:val="ListParagraph"/>
+        <w:numPr>
+          <w:ilvl w:val="0"/>
+          <w:numId w:val="1"/>
+        </w:numPr>
+      </w:pPr>
+      <w:r>
+        <w:t xml:space="preserve">Cancel reverts all unsaved changes back to the last saved state and clears any validation errors.</w:t>
+      </w:r>
+    </w:p>
+    <w:p>
+      <w:pPr>
+        <w:pStyle w:val="ListParagraph"/>
+        <w:numPr>
+          <w:ilvl w:val="0"/>
+          <w:numId w:val="1"/>
+        </w:numPr>
+      </w:pPr>
+      <w:r>
+        <w:t xml:space="preserve">Save and Cancel buttons are disabled when there are no unsaved changes.</w:t>
+      </w:r>
+    </w:p>
+    <w:p>
+      <w:pPr>
+        <w:pStyle w:val="ListParagraph"/>
+        <w:numPr>
+          <w:ilvl w:val="0"/>
+          <w:numId w:val="1"/>
+        </w:numPr>
+      </w:pPr>
+      <w:r>
+        <w:t xml:space="preserve">Changes may take up to 3 hours to process after saving.</w:t>
+      </w:r>
+    </w:p>
+    <w:p>
+      <w:pPr>
+        <w:pStyle w:val="ListParagraph"/>
+        <w:numPr>
+          <w:ilvl w:val="0"/>
+          <w:numId w:val="1"/>
+        </w:numPr>
+      </w:pPr>
+      <w:r>
+        <w:t xml:space="preserve">Users must have a M365 Copilot license to experience Frontier features.</w:t>
+      </w:r>
+    </w:p>
+    <w:p>
+      <w:pPr>
+        <w:pStyle w:val="ListParagraph"/>
+        <w:numPr>
+          <w:ilvl w:val="0"/>
+          <w:numId w:val="1"/>
+        </w:numPr>
+      </w:pPr>
+      <w:r>
+        <w:t xml:space="preserve">The control governs Frontier access across web apps, desktop and mobile apps, and agents — all unified under a single enrollment.</w:t>
       </w:r>
     </w:p>
     <w:p>
@@ -308,7 +416,7 @@
         <w:spacing w:after="200"/>
       </w:pPr>
       <w:r>
-        <w:t xml:space="preserve">As an M365 administrator, I want the system to validate my configuration on save so that I am only blocked when submitting an invalid configuration, not while editing.</w:t>
+        <w:t xml:space="preserve">Frontier agents are governed by this control. Previously, agents were available to all users independent of the admin control.</w:t>
       </w:r>
     </w:p>
     <w:p>
@@ -317,6 +425,88 @@
         <w:spacing w:before="300"/>
       </w:pPr>
       <w:r>
+        <w:t xml:space="preserve">User Stories</w:t>
+      </w:r>
+    </w:p>
+    <w:p>
+      <w:pPr>
+        <w:pStyle w:val="ListParagraph"/>
+        <w:numPr>
+          <w:ilvl w:val="0"/>
+          <w:numId w:val="1"/>
+        </w:numPr>
+      </w:pPr>
+      <w:r>
+        <w:t xml:space="preserve">As an M365 administrator, I want to disable Frontier features for all users so that my organization does not receive experimental features.</w:t>
+      </w:r>
+    </w:p>
+    <w:p>
+      <w:pPr>
+        <w:pStyle w:val="ListParagraph"/>
+        <w:numPr>
+          <w:ilvl w:val="0"/>
+          <w:numId w:val="1"/>
+        </w:numPr>
+      </w:pPr>
+      <w:r>
+        <w:t xml:space="preserve">As an M365 administrator, I want to enable Frontier features for all users so that everyone in my organization can access experimental features and agents.</w:t>
+      </w:r>
+    </w:p>
+    <w:p>
+      <w:pPr>
+        <w:pStyle w:val="ListParagraph"/>
+        <w:numPr>
+          <w:ilvl w:val="0"/>
+          <w:numId w:val="1"/>
+        </w:numPr>
+      </w:pPr>
+      <w:r>
+        <w:t xml:space="preserve">As an M365 administrator, I want to select specific users or Entra groups to receive Frontier features so that I can pilot with a controlled set of users.</w:t>
+      </w:r>
+    </w:p>
+    <w:p>
+      <w:pPr>
+        <w:pStyle w:val="ListParagraph"/>
+        <w:numPr>
+          <w:ilvl w:val="0"/>
+          <w:numId w:val="1"/>
+        </w:numPr>
+      </w:pPr>
+      <w:r>
+        <w:t xml:space="preserve">As an M365 administrator, I want to see a warning when I exceed the allowed user limit so that I understand my configuration cannot be saved until corrected.</w:t>
+      </w:r>
+    </w:p>
+    <w:p>
+      <w:pPr>
+        <w:pStyle w:val="ListParagraph"/>
+        <w:numPr>
+          <w:ilvl w:val="0"/>
+          <w:numId w:val="1"/>
+        </w:numPr>
+      </w:pPr>
+      <w:r>
+        <w:t xml:space="preserve">As an M365 administrator, I want to cancel my unsaved changes so that I can revert to the last saved configuration without risk.</w:t>
+      </w:r>
+    </w:p>
+    <w:p>
+      <w:pPr>
+        <w:pStyle w:val="ListParagraph"/>
+        <w:numPr>
+          <w:ilvl w:val="0"/>
+          <w:numId w:val="1"/>
+        </w:numPr>
+        <w:spacing w:after="200"/>
+      </w:pPr>
+      <w:r>
+        <w:t xml:space="preserve">As an M365 administrator, I want the system to validate my configuration on save so that I am only blocked when submitting an invalid configuration, not while editing.</w:t>
+      </w:r>
+    </w:p>
+    <w:p>
+      <w:pPr>
+        <w:pStyle w:val="Heading2"/>
+        <w:spacing w:before="300"/>
+      </w:pPr>
+      <w:r>
         <w:t xml:space="preserve">Proposed Solution</w:t>
       </w:r>
     </w:p>
@@ -325,7 +515,7 @@
         <w:spacing w:after="200"/>
       </w:pPr>
       <w:r>
-        <w:t xml:space="preserve">A React-based admin control panel embedded in the M365 Admin Center that provides a card-based UI for managing Frontier access. The solution implements three UX variants (tabs) to support A/B testing of different approaches to user/group selection and limit enforcement.</w:t>
+        <w:t xml:space="preserve">A React-based admin control panel embedded in the M365 Admin Center that provides a card-based UI for managing Frontier access. The prototype implements two UX variants: Current (reflecting the existing production UX with inner tabs) and vNext (unified control governing all apps, platforms, and agents with Entra group support).</w:t>
       </w:r>
     </w:p>
     <w:p>
@@ -577,7 +767,7 @@
           </w:tcPr>
           <w:p>
             <w:r>
-              <w:t xml:space="preserve">UX variant preference</w:t>
+              <w:t xml:space="preserve">Change processing SLA</w:t>
             </w:r>
           </w:p>
         </w:tc>
@@ -592,7 +782,7 @@
           </w:tcPr>
           <w:p>
             <w:r>
-              <w:t xml:space="preserve">Identify best-performing variant</w:t>
+              <w:t xml:space="preserve">100% within 3 hours</w:t>
             </w:r>
           </w:p>
         </w:tc>
@@ -607,7 +797,7 @@
           </w:tcPr>
           <w:p>
             <w:r>
-              <w:t xml:space="preserve">A/B test comparing task completion rate</w:t>
+              <w:t xml:space="preserve">Backend processing pipeline monitoring</w:t>
             </w:r>
           </w:p>
         </w:tc>
@@ -631,19 +821,7 @@
         </w:numPr>
       </w:pPr>
       <w:r>
-        <w:t xml:space="preserve">3-user limit too restrictive for large organizations — design for configurable limits</w:t>
-      </w:r>
-    </w:p>
-    <w:p>
-      <w:pPr>
-        <w:pStyle w:val="ListParagraph"/>
-        <w:numPr>
-          <w:ilvl w:val="0"/>
-          <w:numId w:val="1"/>
-        </w:numPr>
-      </w:pPr>
-      <w:r>
-        <w:t xml:space="preserve">Mock Entra data doesn't represent real-world scale — plan for real Entra ID integration</w:t>
+        <w:t xml:space="preserve">10,000-user limit too restrictive for large organizations — design for configurable limits; monitor usage patterns</w:t>
       </w:r>
     </w:p>
     <w:p>
@@ -656,6 +834,18 @@
       </w:pPr>
       <w:r>
         <w:t xml:space="preserve">3-hour processing delay causes admin frustration — clear messaging in UI about processing time</w:t>
+      </w:r>
+    </w:p>
+    <w:p>
+      <w:pPr>
+        <w:pStyle w:val="ListParagraph"/>
+        <w:numPr>
+          <w:ilvl w:val="0"/>
+          <w:numId w:val="1"/>
+        </w:numPr>
+      </w:pPr>
+      <w:r>
+        <w:t xml:space="preserve">Entra group membership resolution at scale — plan for server-side resolution with caching and pagination</w:t>
       </w:r>
     </w:p>
     <w:p>
@@ -689,19 +879,7 @@
         </w:numPr>
       </w:pPr>
       <w:r>
-        <w:t xml:space="preserve">Which UX variant will be selected for production deployment?</w:t>
-      </w:r>
-    </w:p>
-    <w:p>
-      <w:pPr>
-        <w:pStyle w:val="ListParagraph"/>
-        <w:numPr>
-          <w:ilvl w:val="0"/>
-          <w:numId w:val="1"/>
-        </w:numPr>
-      </w:pPr>
-      <w:r>
-        <w:t xml:space="preserve">Will the user limit be configurable per tenant, or remain fixed?</w:t>
+        <w:t xml:space="preserve">Will the 10,000-user limit be configurable per tenant, or remain fixed?</w:t>
       </w:r>
     </w:p>
     <w:p>
@@ -738,6 +916,30 @@
       </w:pPr>
       <w:r>
         <w:t xml:space="preserve">Is role-based access control needed for which admins can modify Frontier settings?</w:t>
+      </w:r>
+    </w:p>
+    <w:p>
+      <w:pPr>
+        <w:pStyle w:val="ListParagraph"/>
+        <w:numPr>
+          <w:ilvl w:val="0"/>
+          <w:numId w:val="1"/>
+        </w:numPr>
+      </w:pPr>
+      <w:r>
+        <w:t xml:space="preserve">Should configuration changes trigger notifications to affected users?</w:t>
+      </w:r>
+    </w:p>
+    <w:p>
+      <w:pPr>
+        <w:pStyle w:val="ListParagraph"/>
+        <w:numPr>
+          <w:ilvl w:val="0"/>
+          <w:numId w:val="1"/>
+        </w:numPr>
+      </w:pPr>
+      <w:r>
+        <w:t xml:space="preserve">What telemetry/audit logging is required for compliance purposes?</w:t>
       </w:r>
     </w:p>
     <w:sectPr>

</xml_diff>